<commit_message>
docs: rend obligatoire la mise a jour de la doc a chaque session
</commit_message>
<xml_diff>
--- a/00 A LIRE AVANT DE COMMANCER SOIT PAR 48 59 OU CLAUDE.docx
+++ b/00 A LIRE AVANT DE COMMANCER SOIT PAR 48 59 OU CLAUDE.docx
@@ -20,6 +20,66 @@
     <w:p>
       <w:r>
         <w:t>Avant de terminer, mets à jour TASKS.md, CURRENT_STATE.md, HANDOFF.md et CHANGELOG_AI.md.</w:t>
+      </w:r>
+    </w:p>
+    <w:p/>
+    <w:p>
+      <w:r>
+        <w:rPr>
+          <w:b/>
+          <w:bCs/>
+        </w:rPr>
+        <w:t>Comment l'utiliser concrètement</w:t>
+      </w:r>
+      <w:r>
+        <w:t xml:space="preserve"> :</w:t>
+      </w:r>
+    </w:p>
+    <w:p>
+      <w:r>
+        <w:t xml:space="preserve"> </w:t>
+      </w:r>
+      <w:proofErr w:type="gramStart"/>
+      <w:r>
+        <w:t>la</w:t>
+      </w:r>
+      <w:proofErr w:type="gramEnd"/>
+      <w:r>
+        <w:t xml:space="preserve"> prochaine fois que tu ouvres une session avec </w:t>
+      </w:r>
+      <w:proofErr w:type="spellStart"/>
+      <w:r>
+        <w:t>ChatGPT</w:t>
+      </w:r>
+      <w:proofErr w:type="spellEnd"/>
+      <w:r>
+        <w:t xml:space="preserve"> (ou une nouvelle session Claude), </w:t>
+      </w:r>
+    </w:p>
+    <w:p>
+      <w:pPr>
+        <w:rPr>
+          <w:color w:val="EE0000"/>
+        </w:rPr>
+      </w:pPr>
+      <w:proofErr w:type="gramStart"/>
+      <w:r>
+        <w:rPr>
+          <w:color w:val="EE0000"/>
+        </w:rPr>
+        <w:t>colle</w:t>
+      </w:r>
+      <w:proofErr w:type="gramEnd"/>
+      <w:r>
+        <w:rPr>
+          <w:color w:val="EE0000"/>
+        </w:rPr>
+        <w:t xml:space="preserve"> le contenu de prompts/MASTER_PROMPT.md. </w:t>
+      </w:r>
+    </w:p>
+    <w:p>
+      <w:r>
+        <w:t>L'assistant lira ces fichiers avant de proposer quoi que ce soit, au lieu de repartir de zéro ou d'halluciner l'état du projet.</w:t>
       </w:r>
     </w:p>
     <w:sectPr>

</xml_diff>